<commit_message>
fix(logging): request log lines reach the host logger; errors carry the correlation id
- UseSerilogRequestLogging used the silent static Log.Logger (preserveStaticLogger): pass the host logger
- Correlation middleware now runs before exception handling, so error lines keep the id
- JobRunnerLoggingTests: missing using
- STD defects D-06, D-07

Co-Authored-By: Claude Opus 5.5 <noreply@anthropic.com>
</commit_message>
<xml_diff>
--- a/docs/installation/TA9-Installation-Guide.docx
+++ b/docs/installation/TA9-Installation-Guide.docx
@@ -16927,6 +16927,206 @@
                 <w:szCs w:val="16"/>
               </w:rPr>
               <w:t xml:space="preserve">@()</w:t>
+            </w:r>
+          </w:p>
+        </w:tc>
+      </w:tr>
+      <w:tr>
+        <w:tc>
+          <w:tcPr>
+            <w:tcW w:type="dxa" w:w="3212"/>
+            <w:tcBorders>
+              <w:top w:val="single" w:color="BFBFBF" w:sz="4"/>
+              <w:left w:val="single" w:color="BFBFBF" w:sz="4"/>
+              <w:bottom w:val="single" w:color="BFBFBF" w:sz="4"/>
+              <w:right w:val="single" w:color="BFBFBF" w:sz="4"/>
+            </w:tcBorders>
+            <w:tcMar>
+              <w:top w:type="dxa" w:w="60"/>
+              <w:left w:type="dxa" w:w="100"/>
+              <w:bottom w:type="dxa" w:w="60"/>
+              <w:right w:type="dxa" w:w="100"/>
+            </w:tcMar>
+          </w:tcPr>
+          <w:p>
+            <w:r>
+              <w:rPr>
+                <w:rFonts w:ascii="Calibri" w:cs="Calibri" w:eastAsia="Calibri" w:hAnsi="Calibri"/>
+                <w:sz w:val="18"/>
+                <w:szCs w:val="18"/>
+              </w:rPr>
+              <w:t xml:space="preserve">No </w:t>
+            </w:r>
+            <w:r>
+              <w:rPr>
+                <w:rFonts w:ascii="Consolas" w:cs="Consolas" w:eastAsia="Consolas" w:hAnsi="Consolas"/>
+                <w:color w:val="5B2C6F"/>
+                <w:sz w:val="16"/>
+                <w:szCs w:val="16"/>
+              </w:rPr>
+              <w:t xml:space="preserve">HTTP … responded …</w:t>
+            </w:r>
+            <w:r>
+              <w:rPr>
+                <w:rFonts w:ascii="Calibri" w:cs="Calibri" w:eastAsia="Calibri" w:hAnsi="Calibri"/>
+                <w:sz w:val="18"/>
+                <w:szCs w:val="18"/>
+              </w:rPr>
+              <w:t xml:space="preserve"> request lines in the logs</w:t>
+            </w:r>
+          </w:p>
+        </w:tc>
+        <w:tc>
+          <w:tcPr>
+            <w:tcW w:type="dxa" w:w="3212"/>
+            <w:tcBorders>
+              <w:top w:val="single" w:color="BFBFBF" w:sz="4"/>
+              <w:left w:val="single" w:color="BFBFBF" w:sz="4"/>
+              <w:bottom w:val="single" w:color="BFBFBF" w:sz="4"/>
+              <w:right w:val="single" w:color="BFBFBF" w:sz="4"/>
+            </w:tcBorders>
+            <w:tcMar>
+              <w:top w:type="dxa" w:w="60"/>
+              <w:left w:type="dxa" w:w="100"/>
+              <w:bottom w:type="dxa" w:w="60"/>
+              <w:right w:type="dxa" w:w="100"/>
+            </w:tcMar>
+          </w:tcPr>
+          <w:p>
+            <w:r>
+              <w:rPr>
+                <w:rFonts w:ascii="Calibri" w:cs="Calibri" w:eastAsia="Calibri" w:hAnsi="Calibri"/>
+                <w:sz w:val="18"/>
+                <w:szCs w:val="18"/>
+              </w:rPr>
+              <w:t xml:space="preserve">Serilog's request logging used the static </w:t>
+            </w:r>
+            <w:r>
+              <w:rPr>
+                <w:rFonts w:ascii="Consolas" w:cs="Consolas" w:eastAsia="Consolas" w:hAnsi="Consolas"/>
+                <w:color w:val="5B2C6F"/>
+                <w:sz w:val="16"/>
+                <w:szCs w:val="16"/>
+              </w:rPr>
+              <w:t xml:space="preserve">Log.Logger</w:t>
+            </w:r>
+            <w:r>
+              <w:rPr>
+                <w:rFonts w:ascii="Calibri" w:cs="Calibri" w:eastAsia="Calibri" w:hAnsi="Calibri"/>
+                <w:sz w:val="18"/>
+                <w:szCs w:val="18"/>
+              </w:rPr>
+              <w:t xml:space="preserve">, which the services never configure</w:t>
+            </w:r>
+          </w:p>
+        </w:tc>
+        <w:tc>
+          <w:tcPr>
+            <w:tcW w:type="dxa" w:w="3214"/>
+            <w:tcBorders>
+              <w:top w:val="single" w:color="BFBFBF" w:sz="4"/>
+              <w:left w:val="single" w:color="BFBFBF" w:sz="4"/>
+              <w:bottom w:val="single" w:color="BFBFBF" w:sz="4"/>
+              <w:right w:val="single" w:color="BFBFBF" w:sz="4"/>
+            </w:tcBorders>
+            <w:tcMar>
+              <w:top w:type="dxa" w:w="60"/>
+              <w:left w:type="dxa" w:w="100"/>
+              <w:bottom w:type="dxa" w:w="60"/>
+              <w:right w:type="dxa" w:w="100"/>
+            </w:tcMar>
+          </w:tcPr>
+          <w:p>
+            <w:r>
+              <w:rPr>
+                <w:rFonts w:ascii="Calibri" w:cs="Calibri" w:eastAsia="Calibri" w:hAnsi="Calibri"/>
+                <w:sz w:val="18"/>
+                <w:szCs w:val="18"/>
+              </w:rPr>
+              <w:t xml:space="preserve">The middleware now uses the service's own logger</w:t>
+            </w:r>
+          </w:p>
+        </w:tc>
+      </w:tr>
+      <w:tr>
+        <w:tc>
+          <w:tcPr>
+            <w:tcW w:type="dxa" w:w="3212"/>
+            <w:tcBorders>
+              <w:top w:val="single" w:color="BFBFBF" w:sz="4"/>
+              <w:left w:val="single" w:color="BFBFBF" w:sz="4"/>
+              <w:bottom w:val="single" w:color="BFBFBF" w:sz="4"/>
+              <w:right w:val="single" w:color="BFBFBF" w:sz="4"/>
+            </w:tcBorders>
+            <w:tcMar>
+              <w:top w:type="dxa" w:w="60"/>
+              <w:left w:type="dxa" w:w="100"/>
+              <w:bottom w:type="dxa" w:w="60"/>
+              <w:right w:type="dxa" w:w="100"/>
+            </w:tcMar>
+          </w:tcPr>
+          <w:p>
+            <w:r>
+              <w:rPr>
+                <w:rFonts w:ascii="Calibri" w:cs="Calibri" w:eastAsia="Calibri" w:hAnsi="Calibri"/>
+                <w:sz w:val="18"/>
+                <w:szCs w:val="18"/>
+              </w:rPr>
+              <w:t xml:space="preserve">Error lines of failed requests had no correlation id</w:t>
+            </w:r>
+          </w:p>
+        </w:tc>
+        <w:tc>
+          <w:tcPr>
+            <w:tcW w:type="dxa" w:w="3212"/>
+            <w:tcBorders>
+              <w:top w:val="single" w:color="BFBFBF" w:sz="4"/>
+              <w:left w:val="single" w:color="BFBFBF" w:sz="4"/>
+              <w:bottom w:val="single" w:color="BFBFBF" w:sz="4"/>
+              <w:right w:val="single" w:color="BFBFBF" w:sz="4"/>
+            </w:tcBorders>
+            <w:tcMar>
+              <w:top w:type="dxa" w:w="60"/>
+              <w:left w:type="dxa" w:w="100"/>
+              <w:bottom w:type="dxa" w:w="60"/>
+              <w:right w:type="dxa" w:w="100"/>
+            </w:tcMar>
+          </w:tcPr>
+          <w:p>
+            <w:r>
+              <w:rPr>
+                <w:rFonts w:ascii="Calibri" w:cs="Calibri" w:eastAsia="Calibri" w:hAnsi="Calibri"/>
+                <w:sz w:val="18"/>
+                <w:szCs w:val="18"/>
+              </w:rPr>
+              <w:t xml:space="preserve">Exception handling ran before the correlation middleware</w:t>
+            </w:r>
+          </w:p>
+        </w:tc>
+        <w:tc>
+          <w:tcPr>
+            <w:tcW w:type="dxa" w:w="3214"/>
+            <w:tcBorders>
+              <w:top w:val="single" w:color="BFBFBF" w:sz="4"/>
+              <w:left w:val="single" w:color="BFBFBF" w:sz="4"/>
+              <w:bottom w:val="single" w:color="BFBFBF" w:sz="4"/>
+              <w:right w:val="single" w:color="BFBFBF" w:sz="4"/>
+            </w:tcBorders>
+            <w:tcMar>
+              <w:top w:type="dxa" w:w="60"/>
+              <w:left w:type="dxa" w:w="100"/>
+              <w:bottom w:type="dxa" w:w="60"/>
+              <w:right w:type="dxa" w:w="100"/>
+            </w:tcMar>
+          </w:tcPr>
+          <w:p>
+            <w:r>
+              <w:rPr>
+                <w:rFonts w:ascii="Calibri" w:cs="Calibri" w:eastAsia="Calibri" w:hAnsi="Calibri"/>
+                <w:sz w:val="18"/>
+                <w:szCs w:val="18"/>
+              </w:rPr>
+              <w:t xml:space="preserve">Correlation middleware runs first</w:t>
             </w:r>
           </w:p>
         </w:tc>

</xml_diff>

<commit_message>
docs(installation): new repository name, clone (SSH, HTTPS fallback) and the dev branch
Adds 6.9 git clone: Permission denied (publickey).

Co-Authored-By: Claude Opus 5.5 <noreply@anthropic.com>
</commit_message>
<xml_diff>
--- a/docs/installation/TA9-Installation-Guide.docx
+++ b/docs/installation/TA9-Installation-Guide.docx
@@ -224,7 +224,26 @@
                 <w:sz w:val="18"/>
                 <w:szCs w:val="18"/>
               </w:rPr>
-              <w:t xml:space="preserve">https://github.com/orontamir/Ta9_Oron</w:t>
+              <w:t xml:space="preserve">https://github.com/orontamir/Ta9_OronTamir_HomeAssignment (branch </w:t>
+            </w:r>
+            <w:r>
+              <w:rPr>
+                <w:rFonts w:ascii="Consolas" w:cs="Consolas" w:eastAsia="Consolas" w:hAnsi="Consolas"/>
+                <w:b/>
+                <w:bCs/>
+                <w:color w:val="5B2C6F"/>
+                <w:sz w:val="16"/>
+                <w:szCs w:val="16"/>
+              </w:rPr>
+              <w:t xml:space="preserve">dev</w:t>
+            </w:r>
+            <w:r>
+              <w:rPr>
+                <w:rFonts w:ascii="Calibri" w:cs="Calibri" w:eastAsia="Calibri" w:hAnsi="Calibri"/>
+                <w:sz w:val="18"/>
+                <w:szCs w:val="18"/>
+              </w:rPr>
+              <w:t xml:space="preserve">)</w:t>
             </w:r>
           </w:p>
         </w:tc>
@@ -1340,12 +1359,34 @@
         </w:p>
         <w:p>
           <w:pPr>
+            <w:pStyle w:val="TOC2"/>
+            <w:tabs>
+              <w:tab w:val="right" w:pos="9638" w:leader="dot"/>
+            </w:tabs>
+          </w:pPr>
+          <w:hyperlink w:history="1" w:anchor="_Toc39">
+            <w:r>
+              <w:t xml:space="preserve">6.9 git clone: Permission denied (publickey)</w:t>
+            </w:r>
+            <w:r>
+              <w:tab/>
+            </w:r>
+            <w:r>
+              <w:fldChar w:fldCharType="begin" w:dirty="true"/>
+              <w:instrText xml:space="preserve">PAGEREF _Toc39 \h</w:instrText>
+              <w:fldChar w:fldCharType="separate"/>
+              <w:fldChar w:fldCharType="end"/>
+            </w:r>
+          </w:hyperlink>
+        </w:p>
+        <w:p>
+          <w:pPr>
             <w:pStyle w:val="TOC1"/>
             <w:tabs>
               <w:tab w:val="right" w:pos="9638" w:leader="dot"/>
             </w:tabs>
           </w:pPr>
-          <w:hyperlink w:history="1" w:anchor="_Toc39">
+          <w:hyperlink w:history="1" w:anchor="_Toc40">
             <w:r>
               <w:t xml:space="preserve">7. Uninstall</w:t>
             </w:r>
@@ -1354,7 +1395,7 @@
             </w:r>
             <w:r>
               <w:fldChar w:fldCharType="begin" w:dirty="true"/>
-              <w:instrText xml:space="preserve">PAGEREF _Toc39 \h</w:instrText>
+              <w:instrText xml:space="preserve">PAGEREF _Toc40 \h</w:instrText>
               <w:fldChar w:fldCharType="separate"/>
               <w:fldChar w:fldCharType="end"/>
             </w:r>
@@ -4290,6 +4331,76 @@
     </w:p>
     <w:p>
       <w:pPr>
+        <w:spacing w:after="120"/>
+      </w:pPr>
+      <w:r>
+        <w:rPr>
+          <w:rFonts w:ascii="Calibri" w:cs="Calibri" w:eastAsia="Calibri" w:hAnsi="Calibri"/>
+          <w:b/>
+          <w:bCs/>
+        </w:rPr>
+        <w:t xml:space="preserve">1. Clone the repository</w:t>
+      </w:r>
+      <w:r>
+        <w:rPr>
+          <w:rFonts w:ascii="Calibri" w:cs="Calibri" w:eastAsia="Calibri" w:hAnsi="Calibri"/>
+        </w:rPr>
+        <w:t xml:space="preserve"> (SSH):</w:t>
+      </w:r>
+    </w:p>
+    <w:p>
+      <w:pPr>
+        <w:keepNext w:val="false"/>
+        <w:pBdr>
+          <w:top w:val="single" w:color="D9D9D9" w:sz="4" w:space="4"/>
+        </w:pBdr>
+        <w:shd w:fill="F3F3F3" w:color="auto" w:val="clear"/>
+        <w:spacing w:after="0" w:before="0" w:line="260"/>
+        <w:ind w:left="120" w:right="120"/>
+      </w:pPr>
+      <w:r>
+        <w:rPr>
+          <w:rFonts w:ascii="Consolas" w:cs="Consolas" w:eastAsia="Consolas" w:hAnsi="Consolas"/>
+          <w:color w:val="1F1F1F"/>
+          <w:sz w:val="17"/>
+          <w:szCs w:val="17"/>
+        </w:rPr>
+        <w:t xml:space="preserve">git clone git@github.com:orontamir/Ta9_OronTamir_HomeAssignment.git</w:t>
+      </w:r>
+    </w:p>
+    <w:p>
+      <w:pPr>
+        <w:spacing w:after="120"/>
+      </w:pPr>
+    </w:p>
+    <w:p>
+      <w:pPr>
+        <w:spacing w:after="120"/>
+      </w:pPr>
+      <w:r>
+        <w:rPr>
+          <w:rFonts w:ascii="Calibri" w:cs="Calibri" w:eastAsia="Calibri" w:hAnsi="Calibri"/>
+        </w:rPr>
+        <w:t xml:space="preserve">If this fails with </w:t>
+      </w:r>
+      <w:r>
+        <w:rPr>
+          <w:rFonts w:ascii="Consolas" w:cs="Consolas" w:eastAsia="Consolas" w:hAnsi="Consolas"/>
+          <w:color w:val="5B2C6F"/>
+          <w:sz w:val="19"/>
+          <w:szCs w:val="19"/>
+        </w:rPr>
+        <w:t xml:space="preserve">Permission denied (publickey)</w:t>
+      </w:r>
+      <w:r>
+        <w:rPr>
+          <w:rFonts w:ascii="Calibri" w:cs="Calibri" w:eastAsia="Calibri" w:hAnsi="Calibri"/>
+        </w:rPr>
+        <w:t xml:space="preserve">, the machine has no SSH key registered with GitHub. Clone over HTTPS instead. Git Credential Manager signs you in through the browser if needed (see §6.9):</w:t>
+      </w:r>
+    </w:p>
+    <w:p>
+      <w:pPr>
         <w:keepNext/>
         <w:pBdr>
           <w:top w:val="single" w:color="D9D9D9" w:sz="4" w:space="4"/>
@@ -4305,7 +4416,7 @@
           <w:sz w:val="17"/>
           <w:szCs w:val="17"/>
         </w:rPr>
-        <w:t xml:space="preserve">git clone https://github.com/orontamir/Ta9_Oron.git</w:t>
+        <w:t xml:space="preserve">git config --global credential.helper manager</w:t>
       </w:r>
     </w:p>
     <w:p>
@@ -4325,13 +4436,139 @@
           <w:sz w:val="17"/>
           <w:szCs w:val="17"/>
         </w:rPr>
-        <w:t xml:space="preserve">cd Ta9_Oron</w:t>
+        <w:t xml:space="preserve">git clone https://github.com/orontamir/Ta9_OronTamir_HomeAssignment.git</w:t>
       </w:r>
     </w:p>
     <w:p>
       <w:pPr>
         <w:spacing w:after="120"/>
       </w:pPr>
+    </w:p>
+    <w:p>
+      <w:pPr>
+        <w:spacing w:after="120"/>
+      </w:pPr>
+      <w:r>
+        <w:rPr>
+          <w:rFonts w:ascii="Calibri" w:cs="Calibri" w:eastAsia="Calibri" w:hAnsi="Calibri"/>
+          <w:b/>
+          <w:bCs/>
+        </w:rPr>
+        <w:t xml:space="preserve">2. Switch to the </w:t>
+      </w:r>
+      <w:r>
+        <w:rPr>
+          <w:rFonts w:ascii="Consolas" w:cs="Consolas" w:eastAsia="Consolas" w:hAnsi="Consolas"/>
+          <w:b/>
+          <w:bCs/>
+          <w:color w:val="5B2C6F"/>
+          <w:sz w:val="19"/>
+          <w:szCs w:val="19"/>
+        </w:rPr>
+        <w:t xml:space="preserve">dev</w:t>
+      </w:r>
+      <w:r>
+        <w:rPr>
+          <w:rFonts w:ascii="Calibri" w:cs="Calibri" w:eastAsia="Calibri" w:hAnsi="Calibri"/>
+          <w:b/>
+          <w:bCs/>
+        </w:rPr>
+        <w:t xml:space="preserve"> branch</w:t>
+      </w:r>
+      <w:r>
+        <w:rPr>
+          <w:rFonts w:ascii="Calibri" w:cs="Calibri" w:eastAsia="Calibri" w:hAnsi="Calibri"/>
+        </w:rPr>
+        <w:t xml:space="preserve">, which holds the submitted version:</w:t>
+      </w:r>
+    </w:p>
+    <w:p>
+      <w:pPr>
+        <w:keepNext/>
+        <w:pBdr>
+          <w:top w:val="single" w:color="D9D9D9" w:sz="4" w:space="4"/>
+        </w:pBdr>
+        <w:shd w:fill="F3F3F3" w:color="auto" w:val="clear"/>
+        <w:spacing w:after="0" w:before="0" w:line="260"/>
+        <w:ind w:left="120" w:right="120"/>
+      </w:pPr>
+      <w:r>
+        <w:rPr>
+          <w:rFonts w:ascii="Consolas" w:cs="Consolas" w:eastAsia="Consolas" w:hAnsi="Consolas"/>
+          <w:color w:val="1F1F1F"/>
+          <w:sz w:val="17"/>
+          <w:szCs w:val="17"/>
+        </w:rPr>
+        <w:t xml:space="preserve">cd Ta9_OronTamir_HomeAssignment</w:t>
+      </w:r>
+    </w:p>
+    <w:p>
+      <w:pPr>
+        <w:keepNext/>
+        <w:shd w:fill="F3F3F3" w:color="auto" w:val="clear"/>
+        <w:spacing w:after="0" w:before="0" w:line="260"/>
+        <w:ind w:left="120" w:right="120"/>
+      </w:pPr>
+      <w:r>
+        <w:rPr>
+          <w:rFonts w:ascii="Consolas" w:cs="Consolas" w:eastAsia="Consolas" w:hAnsi="Consolas"/>
+          <w:color w:val="1F1F1F"/>
+          <w:sz w:val="17"/>
+          <w:szCs w:val="17"/>
+        </w:rPr>
+        <w:t xml:space="preserve">git checkout dev</w:t>
+      </w:r>
+    </w:p>
+    <w:p>
+      <w:pPr>
+        <w:keepNext w:val="false"/>
+        <w:pBdr>
+          <w:bottom w:val="single" w:color="D9D9D9" w:sz="4" w:space="4"/>
+        </w:pBdr>
+        <w:shd w:fill="F3F3F3" w:color="auto" w:val="clear"/>
+        <w:spacing w:after="0" w:before="0" w:line="260"/>
+        <w:ind w:left="120" w:right="120"/>
+      </w:pPr>
+      <w:r>
+        <w:rPr>
+          <w:rFonts w:ascii="Consolas" w:cs="Consolas" w:eastAsia="Consolas" w:hAnsi="Consolas"/>
+          <w:color w:val="1F1F1F"/>
+          <w:sz w:val="17"/>
+          <w:szCs w:val="17"/>
+        </w:rPr>
+        <w:t xml:space="preserve">git log --oneline -3          # check: the latest commits are listed</w:t>
+      </w:r>
+    </w:p>
+    <w:p>
+      <w:pPr>
+        <w:spacing w:after="120"/>
+      </w:pPr>
+    </w:p>
+    <w:p>
+      <w:pPr>
+        <w:spacing w:after="120"/>
+      </w:pPr>
+      <w:r>
+        <w:rPr>
+          <w:rFonts w:ascii="Calibri" w:cs="Calibri" w:eastAsia="Calibri" w:hAnsi="Calibri"/>
+        </w:rPr>
+        <w:t xml:space="preserve">All commands in this guide run from this folder (where </w:t>
+      </w:r>
+      <w:r>
+        <w:rPr>
+          <w:rFonts w:ascii="Consolas" w:cs="Consolas" w:eastAsia="Consolas" w:hAnsi="Consolas"/>
+          <w:color w:val="5B2C6F"/>
+          <w:sz w:val="19"/>
+          <w:szCs w:val="19"/>
+        </w:rPr>
+        <w:t xml:space="preserve">docker-compose.yml</w:t>
+      </w:r>
+      <w:r>
+        <w:rPr>
+          <w:rFonts w:ascii="Calibri" w:cs="Calibri" w:eastAsia="Calibri" w:hAnsi="Calibri"/>
+        </w:rPr>
+        <w:t xml:space="preserve"> is).</w:t>
+      </w:r>
     </w:p>
     <w:p>
       <w:pPr>
@@ -16920,7 +17157,7 @@
           <w:sz w:val="17"/>
           <w:szCs w:val="17"/>
         </w:rPr>
-        <w:t xml:space="preserve">remote: Permission to orontamir/Ta9_Oron.git denied to &lt;other-account&gt;.</w:t>
+        <w:t xml:space="preserve">remote: Permission to orontamir/Ta9_OronTamir_HomeAssignment.git denied to &lt;other-account&gt;.</w:t>
       </w:r>
     </w:p>
     <w:p>
@@ -16940,7 +17177,7 @@
           <w:sz w:val="17"/>
           <w:szCs w:val="17"/>
         </w:rPr>
-        <w:t xml:space="preserve">fatal: unable to access 'https://github.com/orontamir/Ta9_Oron.git/': The requested URL returned error: 403</w:t>
+        <w:t xml:space="preserve">fatal: unable to access 'https://github.com/orontamir/Ta9_OronTamir_HomeAssignment.git/': The requested URL returned error: 403</w:t>
       </w:r>
     </w:p>
     <w:p>
@@ -17047,7 +17284,7 @@
           <w:sz w:val="17"/>
           <w:szCs w:val="17"/>
         </w:rPr>
-        <w:t xml:space="preserve">git remote set-url origin https://orontamir@github.com/orontamir/Ta9_Oron.git</w:t>
+        <w:t xml:space="preserve">git remote set-url origin https://orontamir@github.com/orontamir/Ta9_OronTamir_HomeAssignment.git</w:t>
       </w:r>
     </w:p>
     <w:p>
@@ -20196,16 +20433,305 @@
     </w:p>
     <w:p>
       <w:pPr>
+        <w:pStyle w:val="Heading2"/>
+      </w:pPr>
+      <w:bookmarkStart w:name="_Toc39" w:id="39"/>
+      <w:r>
+        <w:rPr>
+          <w:rFonts w:ascii="Calibri" w:cs="Calibri" w:eastAsia="Calibri" w:hAnsi="Calibri"/>
+        </w:rPr>
+        <w:t xml:space="preserve">6.9 git clone: Permission denied (publickey)</w:t>
+      </w:r>
+      <w:bookmarkEnd w:id="39"/>
+    </w:p>
+    <w:p>
+      <w:pPr>
+        <w:keepNext/>
+        <w:pBdr>
+          <w:top w:val="single" w:color="D9D9D9" w:sz="4" w:space="4"/>
+        </w:pBdr>
+        <w:shd w:fill="F3F3F3" w:color="auto" w:val="clear"/>
+        <w:spacing w:after="0" w:before="0" w:line="260"/>
+        <w:ind w:left="120" w:right="120"/>
+      </w:pPr>
+      <w:r>
+        <w:rPr>
+          <w:rFonts w:ascii="Consolas" w:cs="Consolas" w:eastAsia="Consolas" w:hAnsi="Consolas"/>
+          <w:color w:val="1F1F1F"/>
+          <w:sz w:val="17"/>
+          <w:szCs w:val="17"/>
+        </w:rPr>
+        <w:t xml:space="preserve">git@github.com: Permission denied (publickey).</w:t>
+      </w:r>
+    </w:p>
+    <w:p>
+      <w:pPr>
+        <w:keepNext w:val="false"/>
+        <w:pBdr>
+          <w:bottom w:val="single" w:color="D9D9D9" w:sz="4" w:space="4"/>
+        </w:pBdr>
+        <w:shd w:fill="F3F3F3" w:color="auto" w:val="clear"/>
+        <w:spacing w:after="0" w:before="0" w:line="260"/>
+        <w:ind w:left="120" w:right="120"/>
+      </w:pPr>
+      <w:r>
+        <w:rPr>
+          <w:rFonts w:ascii="Consolas" w:cs="Consolas" w:eastAsia="Consolas" w:hAnsi="Consolas"/>
+          <w:color w:val="1F1F1F"/>
+          <w:sz w:val="17"/>
+          <w:szCs w:val="17"/>
+        </w:rPr>
+        <w:t xml:space="preserve">fatal: Could not read from remote repository.</w:t>
+      </w:r>
+    </w:p>
+    <w:p>
+      <w:pPr>
+        <w:spacing w:after="120"/>
+      </w:pPr>
+    </w:p>
+    <w:p>
+      <w:pPr>
+        <w:spacing w:after="120"/>
+      </w:pPr>
+      <w:r>
+        <w:rPr>
+          <w:rFonts w:ascii="Calibri" w:cs="Calibri" w:eastAsia="Calibri" w:hAnsi="Calibri"/>
+          <w:b/>
+          <w:bCs/>
+        </w:rPr>
+        <w:t xml:space="preserve">Cause:</w:t>
+      </w:r>
+      <w:r>
+        <w:rPr>
+          <w:rFonts w:ascii="Calibri" w:cs="Calibri" w:eastAsia="Calibri" w:hAnsi="Calibri"/>
+        </w:rPr>
+        <w:t xml:space="preserve"> an SSH address (</w:t>
+      </w:r>
+      <w:r>
+        <w:rPr>
+          <w:rFonts w:ascii="Consolas" w:cs="Consolas" w:eastAsia="Consolas" w:hAnsi="Consolas"/>
+          <w:color w:val="5B2C6F"/>
+          <w:sz w:val="19"/>
+          <w:szCs w:val="19"/>
+        </w:rPr>
+        <w:t xml:space="preserve">git@github.com:…</w:t>
+      </w:r>
+      <w:r>
+        <w:rPr>
+          <w:rFonts w:ascii="Calibri" w:cs="Calibri" w:eastAsia="Calibri" w:hAnsi="Calibri"/>
+        </w:rPr>
+        <w:t xml:space="preserve">) needs an SSH key that is registered with your GitHub account, and this machine has none. A related message is </w:t>
+      </w:r>
+      <w:r>
+        <w:rPr>
+          <w:rFonts w:ascii="Consolas" w:cs="Consolas" w:eastAsia="Consolas" w:hAnsi="Consolas"/>
+          <w:color w:val="5B2C6F"/>
+          <w:sz w:val="19"/>
+          <w:szCs w:val="19"/>
+        </w:rPr>
+        <w:t xml:space="preserve">Permission to … denied to &lt;other-account&gt;</w:t>
+      </w:r>
+      <w:r>
+        <w:rPr>
+          <w:rFonts w:ascii="Calibri" w:cs="Calibri" w:eastAsia="Calibri" w:hAnsi="Calibri"/>
+        </w:rPr>
+        <w:t xml:space="preserve">: SSH used another account's key.</w:t>
+      </w:r>
+    </w:p>
+    <w:p>
+      <w:pPr>
+        <w:spacing w:after="120"/>
+      </w:pPr>
+      <w:r>
+        <w:rPr>
+          <w:rFonts w:ascii="Calibri" w:cs="Calibri" w:eastAsia="Calibri" w:hAnsi="Calibri"/>
+          <w:b/>
+          <w:bCs/>
+        </w:rPr>
+        <w:t xml:space="preserve">Fix:</w:t>
+      </w:r>
+      <w:r>
+        <w:rPr>
+          <w:rFonts w:ascii="Calibri" w:cs="Calibri" w:eastAsia="Calibri" w:hAnsi="Calibri"/>
+        </w:rPr>
+        <w:t xml:space="preserve"> clone over HTTPS with Git Credential Manager. It signs you in through the browser; make sure the browser is signed in to the right GitHub account before clicking </w:t>
+      </w:r>
+      <w:r>
+        <w:rPr>
+          <w:rFonts w:ascii="Calibri" w:cs="Calibri" w:eastAsia="Calibri" w:hAnsi="Calibri"/>
+          <w:i/>
+          <w:iCs/>
+        </w:rPr>
+        <w:t xml:space="preserve">Authorize</w:t>
+      </w:r>
+      <w:r>
+        <w:rPr>
+          <w:rFonts w:ascii="Calibri" w:cs="Calibri" w:eastAsia="Calibri" w:hAnsi="Calibri"/>
+        </w:rPr>
+        <w:t xml:space="preserve">.</w:t>
+      </w:r>
+    </w:p>
+    <w:p>
+      <w:pPr>
+        <w:keepNext/>
+        <w:pBdr>
+          <w:top w:val="single" w:color="D9D9D9" w:sz="4" w:space="4"/>
+        </w:pBdr>
+        <w:shd w:fill="F3F3F3" w:color="auto" w:val="clear"/>
+        <w:spacing w:after="0" w:before="0" w:line="260"/>
+        <w:ind w:left="120" w:right="120"/>
+      </w:pPr>
+      <w:r>
+        <w:rPr>
+          <w:rFonts w:ascii="Consolas" w:cs="Consolas" w:eastAsia="Consolas" w:hAnsi="Consolas"/>
+          <w:color w:val="1F1F1F"/>
+          <w:sz w:val="17"/>
+          <w:szCs w:val="17"/>
+        </w:rPr>
+        <w:t xml:space="preserve">git config --global credential.helper manager</w:t>
+      </w:r>
+    </w:p>
+    <w:p>
+      <w:pPr>
+        <w:keepNext/>
+        <w:shd w:fill="F3F3F3" w:color="auto" w:val="clear"/>
+        <w:spacing w:after="0" w:before="0" w:line="260"/>
+        <w:ind w:left="120" w:right="120"/>
+      </w:pPr>
+      <w:r>
+        <w:rPr>
+          <w:rFonts w:ascii="Consolas" w:cs="Consolas" w:eastAsia="Consolas" w:hAnsi="Consolas"/>
+          <w:color w:val="1F1F1F"/>
+          <w:sz w:val="17"/>
+          <w:szCs w:val="17"/>
+        </w:rPr>
+        <w:t xml:space="preserve">git clone https://github.com/orontamir/Ta9_OronTamir_HomeAssignment.git</w:t>
+      </w:r>
+    </w:p>
+    <w:p>
+      <w:pPr>
+        <w:keepNext/>
+        <w:shd w:fill="F3F3F3" w:color="auto" w:val="clear"/>
+        <w:spacing w:after="0" w:before="0" w:line="260"/>
+        <w:ind w:left="120" w:right="120"/>
+      </w:pPr>
+      <w:r>
+        <w:rPr>
+          <w:rFonts w:ascii="Consolas" w:cs="Consolas" w:eastAsia="Consolas" w:hAnsi="Consolas"/>
+          <w:color w:val="1F1F1F"/>
+          <w:sz w:val="17"/>
+          <w:szCs w:val="17"/>
+        </w:rPr>
+        <w:t xml:space="preserve">cd Ta9_OronTamir_HomeAssignment</w:t>
+      </w:r>
+    </w:p>
+    <w:p>
+      <w:pPr>
+        <w:keepNext w:val="false"/>
+        <w:pBdr>
+          <w:bottom w:val="single" w:color="D9D9D9" w:sz="4" w:space="4"/>
+        </w:pBdr>
+        <w:shd w:fill="F3F3F3" w:color="auto" w:val="clear"/>
+        <w:spacing w:after="0" w:before="0" w:line="260"/>
+        <w:ind w:left="120" w:right="120"/>
+      </w:pPr>
+      <w:r>
+        <w:rPr>
+          <w:rFonts w:ascii="Consolas" w:cs="Consolas" w:eastAsia="Consolas" w:hAnsi="Consolas"/>
+          <w:color w:val="1F1F1F"/>
+          <w:sz w:val="17"/>
+          <w:szCs w:val="17"/>
+        </w:rPr>
+        <w:t xml:space="preserve">git checkout dev</w:t>
+      </w:r>
+    </w:p>
+    <w:p>
+      <w:pPr>
+        <w:spacing w:after="120"/>
+      </w:pPr>
+    </w:p>
+    <w:p>
+      <w:pPr>
+        <w:spacing w:after="120"/>
+      </w:pPr>
+      <w:r>
+        <w:rPr>
+          <w:rFonts w:ascii="Calibri" w:cs="Calibri" w:eastAsia="Calibri" w:hAnsi="Calibri"/>
+        </w:rPr>
+        <w:t xml:space="preserve">To keep using SSH instead: </w:t>
+      </w:r>
+      <w:r>
+        <w:rPr>
+          <w:rFonts w:ascii="Consolas" w:cs="Consolas" w:eastAsia="Consolas" w:hAnsi="Consolas"/>
+          <w:color w:val="5B2C6F"/>
+          <w:sz w:val="19"/>
+          <w:szCs w:val="19"/>
+        </w:rPr>
+        <w:t xml:space="preserve">ssh-keygen -t ed25519</w:t>
+      </w:r>
+      <w:r>
+        <w:rPr>
+          <w:rFonts w:ascii="Calibri" w:cs="Calibri" w:eastAsia="Calibri" w:hAnsi="Calibri"/>
+        </w:rPr>
+        <w:t xml:space="preserve">, add the </w:t>
+      </w:r>
+      <w:r>
+        <w:rPr>
+          <w:rFonts w:ascii="Consolas" w:cs="Consolas" w:eastAsia="Consolas" w:hAnsi="Consolas"/>
+          <w:color w:val="5B2C6F"/>
+          <w:sz w:val="19"/>
+          <w:szCs w:val="19"/>
+        </w:rPr>
+        <w:t xml:space="preserve">.pub</w:t>
+      </w:r>
+      <w:r>
+        <w:rPr>
+          <w:rFonts w:ascii="Calibri" w:cs="Calibri" w:eastAsia="Calibri" w:hAnsi="Calibri"/>
+        </w:rPr>
+        <w:t xml:space="preserve"> file under GitHub → </w:t>
+      </w:r>
+      <w:r>
+        <w:rPr>
+          <w:rFonts w:ascii="Calibri" w:cs="Calibri" w:eastAsia="Calibri" w:hAnsi="Calibri"/>
+          <w:i/>
+          <w:iCs/>
+        </w:rPr>
+        <w:t xml:space="preserve">Settings → SSH and GPG keys</w:t>
+      </w:r>
+      <w:r>
+        <w:rPr>
+          <w:rFonts w:ascii="Calibri" w:cs="Calibri" w:eastAsia="Calibri" w:hAnsi="Calibri"/>
+        </w:rPr>
+        <w:t xml:space="preserve">, then check with </w:t>
+      </w:r>
+      <w:r>
+        <w:rPr>
+          <w:rFonts w:ascii="Consolas" w:cs="Consolas" w:eastAsia="Consolas" w:hAnsi="Consolas"/>
+          <w:color w:val="5B2C6F"/>
+          <w:sz w:val="19"/>
+          <w:szCs w:val="19"/>
+        </w:rPr>
+        <w:t xml:space="preserve">ssh -T git@github.com</w:t>
+      </w:r>
+      <w:r>
+        <w:rPr>
+          <w:rFonts w:ascii="Calibri" w:cs="Calibri" w:eastAsia="Calibri" w:hAnsi="Calibri"/>
+        </w:rPr>
+        <w:t xml:space="preserve">.</w:t>
+      </w:r>
+    </w:p>
+    <w:p>
+      <w:pPr>
         <w:pStyle w:val="Heading1"/>
       </w:pPr>
-      <w:bookmarkStart w:name="_Toc39" w:id="39"/>
+      <w:bookmarkStart w:name="_Toc40" w:id="40"/>
       <w:r>
         <w:rPr>
           <w:rFonts w:ascii="Calibri" w:cs="Calibri" w:eastAsia="Calibri" w:hAnsi="Calibri"/>
         </w:rPr>
         <w:t xml:space="preserve">7. Uninstall</w:t>
       </w:r>
-      <w:bookmarkEnd w:id="39"/>
+      <w:bookmarkEnd w:id="40"/>
     </w:p>
     <w:p>
       <w:pPr>

</xml_diff>